<commit_message>
Fill in author information on cover letter and title page
Co-Authored-By: Claude Sonnet 5.5 <noreply@anthropic.com>
Claude-Session: https://claude.ai/code/session_01HqETZvN3rK1ZqRBAbAYQWS
</commit_message>
<xml_diff>
--- a/dynamic_bertrand/submission/01_Cover_Letter.docx
+++ b/dynamic_bertrand/submission/01_Cover_Letter.docx
@@ -264,7 +264,7 @@
         <w:rPr>
           <w:rFonts w:ascii="Times New Roman" w:hAnsi="Times New Roman"/>
         </w:rPr>
-        <w:t xml:space="preserve"> The manuscript has not been published and is not under consideration elsewhere. All authors have approved the submission. </w:t>
+        <w:t xml:space="preserve"> The manuscript has not been published and is not under consideration elsewhere. The submission has been approved by all authors. </w:t>
       </w:r>
       <w:r>
         <w:rPr>
@@ -341,9 +341,8 @@
       <w:r>
         <w:rPr>
           <w:rFonts w:ascii="Times New Roman" w:hAnsi="Times New Roman"/>
-          <w:highlight w:val="yellow"/>
         </w:rPr>
-        <w:t>[Corresponding author name]</w:t>
+        <w:t>Ook Lee</w:t>
       </w:r>
     </w:p>
     <w:p>
@@ -353,9 +352,8 @@
       <w:r>
         <w:rPr>
           <w:rFonts w:ascii="Times New Roman" w:hAnsi="Times New Roman"/>
-          <w:highlight w:val="yellow"/>
         </w:rPr>
-        <w:t>[Affiliation]</w:t>
+        <w:t>Department of Information Systems, Hanyang University, Seoul, Korea</w:t>
       </w:r>
     </w:p>
     <w:p>
@@ -367,17 +365,6 @@
           <w:rFonts w:ascii="Times New Roman" w:hAnsi="Times New Roman"/>
         </w:rPr>
         <w:t>ooklee@hanyang.ac.kr</w:t>
-      </w:r>
-    </w:p>
-    <w:p>
-      <w:pPr>
-        <w:spacing w:after="0" w:line="259" w:lineRule="auto"/>
-      </w:pPr>
-      <w:r>
-        <w:rPr>
-          <w:rFonts w:ascii="Times New Roman" w:hAnsi="Times New Roman"/>
-        </w:rPr>
-        <w:t>on behalf of all authors</w:t>
       </w:r>
     </w:p>
     <w:sectPr>

</xml_diff>